<commit_message>
Version locale de travail : modifications calendrier, general, profs, etc.
</commit_message>
<xml_diff>
--- a/modele_enveloppe_examen.docx
+++ b/modele_enveloppe_examen.docx
@@ -1,6 +1,6 @@
 
 <file path=word/document.xml><?xml version="1.0" encoding="utf-8"?>
-<w:document xmlns:wpc="http://schemas.microsoft.com/office/word/2010/wordprocessingCanvas" xmlns:cx="http://schemas.microsoft.com/office/drawing/2014/chartex" xmlns:mc="http://schemas.openxmlformats.org/markup-compatibility/2006" xmlns:o="urn:schemas-microsoft-com:office:office" xmlns:r="http://schemas.openxmlformats.org/officeDocument/2006/relationships" xmlns:m="http://schemas.openxmlformats.org/officeDocument/2006/math" xmlns:v="urn:schemas-microsoft-com:vml" xmlns:wp14="http://schemas.microsoft.com/office/word/2010/wordprocessingDrawing" xmlns:wp="http://schemas.openxmlformats.org/drawingml/2006/wordprocessingDrawing" xmlns:w10="urn:schemas-microsoft-com:office:word" xmlns:w="http://schemas.openxmlformats.org/wordprocessingml/2006/main" xmlns:w14="http://schemas.microsoft.com/office/word/2010/wordml" xmlns:w15="http://schemas.microsoft.com/office/word/2012/wordml" xmlns:w16se="http://schemas.microsoft.com/office/word/2015/wordml/symex" xmlns:wpg="http://schemas.microsoft.com/office/word/2010/wordprocessingGroup" xmlns:wpi="http://schemas.microsoft.com/office/word/2010/wordprocessingInk" xmlns:wne="http://schemas.microsoft.com/office/word/2006/wordml" xmlns:wps="http://schemas.microsoft.com/office/word/2010/wordprocessingShape" mc:Ignorable="w14 w15 w16se wp14">
+<w:document xmlns:wpc="http://schemas.microsoft.com/office/word/2010/wordprocessingCanvas" xmlns:cx="http://schemas.microsoft.com/office/drawing/2014/chartex" xmlns:cx1="http://schemas.microsoft.com/office/drawing/2015/9/8/chartex" xmlns:cx2="http://schemas.microsoft.com/office/drawing/2015/10/21/chartex" xmlns:cx3="http://schemas.microsoft.com/office/drawing/2016/5/9/chartex" xmlns:cx4="http://schemas.microsoft.com/office/drawing/2016/5/10/chartex" xmlns:cx5="http://schemas.microsoft.com/office/drawing/2016/5/11/chartex" xmlns:cx6="http://schemas.microsoft.com/office/drawing/2016/5/12/chartex" xmlns:cx7="http://schemas.microsoft.com/office/drawing/2016/5/13/chartex" xmlns:cx8="http://schemas.microsoft.com/office/drawing/2016/5/14/chartex" xmlns:mc="http://schemas.openxmlformats.org/markup-compatibility/2006" xmlns:aink="http://schemas.microsoft.com/office/drawing/2016/ink" xmlns:am3d="http://schemas.microsoft.com/office/drawing/2017/model3d" xmlns:o="urn:schemas-microsoft-com:office:office" xmlns:r="http://schemas.openxmlformats.org/officeDocument/2006/relationships" xmlns:m="http://schemas.openxmlformats.org/officeDocument/2006/math" xmlns:v="urn:schemas-microsoft-com:vml" xmlns:wp14="http://schemas.microsoft.com/office/word/2010/wordprocessingDrawing" xmlns:wp="http://schemas.openxmlformats.org/drawingml/2006/wordprocessingDrawing" xmlns:w10="urn:schemas-microsoft-com:office:word" xmlns:w="http://schemas.openxmlformats.org/wordprocessingml/2006/main" xmlns:w14="http://schemas.microsoft.com/office/word/2010/wordml" xmlns:w15="http://schemas.microsoft.com/office/word/2012/wordml" xmlns:w16cex="http://schemas.microsoft.com/office/word/2018/wordml/cex" xmlns:w16cid="http://schemas.microsoft.com/office/word/2016/wordml/cid" xmlns:w16="http://schemas.microsoft.com/office/word/2018/wordml" xmlns:w16sdtdh="http://schemas.microsoft.com/office/word/2020/wordml/sdtdatahash" xmlns:w16se="http://schemas.microsoft.com/office/word/2015/wordml/symex" xmlns:wpg="http://schemas.microsoft.com/office/word/2010/wordprocessingGroup" xmlns:wpi="http://schemas.microsoft.com/office/word/2010/wordprocessingInk" xmlns:wne="http://schemas.microsoft.com/office/word/2006/wordml" xmlns:wps="http://schemas.microsoft.com/office/word/2010/wordprocessingShape" mc:Ignorable="w14 w15 w16se w16cid w16 w16cex w16sdtdh wp14">
   <w:body>
     <w:p>
       <w:pPr>
@@ -128,7 +128,33 @@
                                 <w:szCs w:val="36"/>
                                 <w:lang w:bidi="ar-TN"/>
                               </w:rPr>
-                              <w:t>{{delegation}}</w:t>
+                              <w:t>{{</w:t>
+                            </w:r>
+                            <w:proofErr w:type="spellStart"/>
+                            <w:r>
+                              <w:rPr>
+                                <w:rFonts w:cs="Andalus"/>
+                                <w:b/>
+                                <w:bCs/>
+                                <w:color w:val="17365D" w:themeColor="text2" w:themeShade="BF"/>
+                                <w:sz w:val="36"/>
+                                <w:szCs w:val="36"/>
+                                <w:lang w:bidi="ar-TN"/>
+                              </w:rPr>
+                              <w:t>delegation</w:t>
+                            </w:r>
+                            <w:proofErr w:type="spellEnd"/>
+                            <w:r>
+                              <w:rPr>
+                                <w:rFonts w:cs="Andalus"/>
+                                <w:b/>
+                                <w:bCs/>
+                                <w:color w:val="17365D" w:themeColor="text2" w:themeShade="BF"/>
+                                <w:sz w:val="36"/>
+                                <w:szCs w:val="36"/>
+                                <w:lang w:bidi="ar-TN"/>
+                              </w:rPr>
+                              <w:t>}}</w:t>
                             </w:r>
                           </w:p>
                           <w:p>
@@ -235,7 +261,33 @@
                                 <w:szCs w:val="36"/>
                                 <w:lang w:bidi="ar-TN"/>
                               </w:rPr>
-                              <w:t>{{annee}}</w:t>
+                              <w:t>{{</w:t>
+                            </w:r>
+                            <w:proofErr w:type="spellStart"/>
+                            <w:r>
+                              <w:rPr>
+                                <w:rFonts w:cs="Andalus"/>
+                                <w:b/>
+                                <w:bCs/>
+                                <w:color w:val="17365D" w:themeColor="text2" w:themeShade="BF"/>
+                                <w:sz w:val="36"/>
+                                <w:szCs w:val="36"/>
+                                <w:lang w:bidi="ar-TN"/>
+                              </w:rPr>
+                              <w:t>annee</w:t>
+                            </w:r>
+                            <w:proofErr w:type="spellEnd"/>
+                            <w:r>
+                              <w:rPr>
+                                <w:rFonts w:cs="Andalus"/>
+                                <w:b/>
+                                <w:bCs/>
+                                <w:color w:val="17365D" w:themeColor="text2" w:themeShade="BF"/>
+                                <w:sz w:val="36"/>
+                                <w:szCs w:val="36"/>
+                                <w:lang w:bidi="ar-TN"/>
+                              </w:rPr>
+                              <w:t>}}</w:t>
                             </w:r>
                           </w:p>
                         </w:txbxContent>
@@ -261,7 +313,7 @@
                 <v:stroke joinstyle="miter"/>
                 <v:path gradientshapeok="t" o:connecttype="rect"/>
               </v:shapetype>
-              <v:shape id="Text Box 2" o:spid="_x0000_s1026" type="#_x0000_t202" style="position:absolute;margin-left:-21.95pt;margin-top:18.2pt;width:282.05pt;height:96.7pt;z-index:251658240;visibility:visible;mso-wrap-style:square;mso-width-percent:0;mso-height-percent:0;mso-wrap-distance-left:9pt;mso-wrap-distance-top:0;mso-wrap-distance-right:9pt;mso-wrap-distance-bottom:0;mso-position-horizontal:absolute;mso-position-horizontal-relative:text;mso-position-vertical:absolute;mso-position-vertical-relative:text;mso-width-percent:0;mso-height-percent:0;mso-width-relative:page;mso-height-relative:page;v-text-anchor:top" o:gfxdata="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" stroked="f">
+              <v:shape id="Text Box 2" o:spid="_x0000_s1026" type="#_x0000_t202" style="position:absolute;margin-left:-21.95pt;margin-top:18.2pt;width:282.05pt;height:96.7pt;z-index:251658240;visibility:visible;mso-wrap-style:square;mso-width-percent:0;mso-height-percent:0;mso-wrap-distance-left:9pt;mso-wrap-distance-top:0;mso-wrap-distance-right:9pt;mso-wrap-distance-bottom:0;mso-position-horizontal:absolute;mso-position-horizontal-relative:text;mso-position-vertical:absolute;mso-position-vertical-relative:text;mso-width-percent:0;mso-height-percent:0;mso-width-relative:page;mso-height-relative:page;v-text-anchor:top" o:gfxdata="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" stroked="f">
                 <v:textbox>
                   <w:txbxContent>
                     <w:p>
@@ -316,7 +368,33 @@
                           <w:szCs w:val="36"/>
                           <w:lang w:bidi="ar-TN"/>
                         </w:rPr>
-                        <w:t>{{delegation}}</w:t>
+                        <w:t>{{</w:t>
+                      </w:r>
+                      <w:proofErr w:type="spellStart"/>
+                      <w:r>
+                        <w:rPr>
+                          <w:rFonts w:cs="Andalus"/>
+                          <w:b/>
+                          <w:bCs/>
+                          <w:color w:val="17365D" w:themeColor="text2" w:themeShade="BF"/>
+                          <w:sz w:val="36"/>
+                          <w:szCs w:val="36"/>
+                          <w:lang w:bidi="ar-TN"/>
+                        </w:rPr>
+                        <w:t>delegation</w:t>
+                      </w:r>
+                      <w:proofErr w:type="spellEnd"/>
+                      <w:r>
+                        <w:rPr>
+                          <w:rFonts w:cs="Andalus"/>
+                          <w:b/>
+                          <w:bCs/>
+                          <w:color w:val="17365D" w:themeColor="text2" w:themeShade="BF"/>
+                          <w:sz w:val="36"/>
+                          <w:szCs w:val="36"/>
+                          <w:lang w:bidi="ar-TN"/>
+                        </w:rPr>
+                        <w:t>}}</w:t>
                       </w:r>
                     </w:p>
                     <w:p>
@@ -423,7 +501,33 @@
                           <w:szCs w:val="36"/>
                           <w:lang w:bidi="ar-TN"/>
                         </w:rPr>
-                        <w:t>{{annee}}</w:t>
+                        <w:t>{{</w:t>
+                      </w:r>
+                      <w:proofErr w:type="spellStart"/>
+                      <w:r>
+                        <w:rPr>
+                          <w:rFonts w:cs="Andalus"/>
+                          <w:b/>
+                          <w:bCs/>
+                          <w:color w:val="17365D" w:themeColor="text2" w:themeShade="BF"/>
+                          <w:sz w:val="36"/>
+                          <w:szCs w:val="36"/>
+                          <w:lang w:bidi="ar-TN"/>
+                        </w:rPr>
+                        <w:t>annee</w:t>
+                      </w:r>
+                      <w:proofErr w:type="spellEnd"/>
+                      <w:r>
+                        <w:rPr>
+                          <w:rFonts w:cs="Andalus"/>
+                          <w:b/>
+                          <w:bCs/>
+                          <w:color w:val="17365D" w:themeColor="text2" w:themeShade="BF"/>
+                          <w:sz w:val="36"/>
+                          <w:szCs w:val="36"/>
+                          <w:lang w:bidi="ar-TN"/>
+                        </w:rPr>
+                        <w:t>}}</w:t>
                       </w:r>
                     </w:p>
                   </w:txbxContent>
@@ -599,7 +703,7 @@
           </mc:Choice>
           <mc:Fallback>
             <w:pict>
-              <v:shape w14:anchorId="051128BC" id="Text Box 3" o:spid="_x0000_s1027" type="#_x0000_t202" style="position:absolute;margin-left:485.65pt;margin-top:18.65pt;width:237.45pt;height:96.25pt;z-index:251659264;visibility:visible;mso-wrap-style:square;mso-width-percent:0;mso-height-percent:0;mso-wrap-distance-left:9pt;mso-wrap-distance-top:0;mso-wrap-distance-right:9pt;mso-wrap-distance-bottom:0;mso-position-horizontal:absolute;mso-position-horizontal-relative:text;mso-position-vertical:absolute;mso-position-vertical-relative:text;mso-width-percent:0;mso-height-percent:0;mso-width-relative:page;mso-height-relative:page;v-text-anchor:top" o:gfxdata="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" stroked="f">
+              <v:shape w14:anchorId="051128BC" id="Text Box 3" o:spid="_x0000_s1027" type="#_x0000_t202" style="position:absolute;margin-left:485.65pt;margin-top:18.65pt;width:237.45pt;height:96.25pt;z-index:251659264;visibility:visible;mso-wrap-style:square;mso-width-percent:0;mso-height-percent:0;mso-wrap-distance-left:9pt;mso-wrap-distance-top:0;mso-wrap-distance-right:9pt;mso-wrap-distance-bottom:0;mso-position-horizontal:absolute;mso-position-horizontal-relative:text;mso-position-vertical:absolute;mso-position-vertical-relative:text;mso-width-percent:0;mso-height-percent:0;mso-width-relative:page;mso-height-relative:page;v-text-anchor:top" o:gfxdata="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" stroked="f">
                 <v:textbox>
                   <w:txbxContent>
                     <w:p>
@@ -1142,19 +1246,71 @@
                                 <w:rtl/>
                                 <w:lang w:bidi="ar-TN"/>
                               </w:rPr>
-                              <w:t>عدد التلاميذ:</w:t>
-                            </w:r>
-                            <w:r>
-                              <w:rPr>
-                                <w:rFonts w:ascii="Angsana New" w:hAnsi="Angsana New" w:cs="Andalus"/>
+                              <w:t xml:space="preserve">عدد </w:t>
+                            </w:r>
+                            <w:proofErr w:type="gramStart"/>
+                            <w:r>
+                              <w:rPr>
+                                <w:rFonts w:ascii="Angsana New" w:hAnsi="Angsana New" w:cs="Andalus" w:hint="cs"/>
                                 <w:b/>
                                 <w:bCs/>
                                 <w:color w:val="17365D" w:themeColor="text2" w:themeShade="BF"/>
                                 <w:sz w:val="96"/>
                                 <w:szCs w:val="96"/>
-                                <w:lang w:bidi="ar-TN"/>
-                              </w:rPr>
-                              <w:t xml:space="preserve">{{nb}} </w:t>
+                                <w:rtl/>
+                                <w:lang w:bidi="ar-TN"/>
+                              </w:rPr>
+                              <w:t>التلاميذ</w:t>
+                            </w:r>
+                            <w:r>
+                              <w:rPr>
+                                <w:rFonts w:ascii="Angsana New" w:hAnsi="Angsana New" w:cs="Andalus" w:hint="cs"/>
+                                <w:b/>
+                                <w:bCs/>
+                                <w:color w:val="365F91" w:themeColor="accent1" w:themeShade="BF"/>
+                                <w:sz w:val="96"/>
+                                <w:szCs w:val="96"/>
+                                <w:rtl/>
+                                <w:lang w:bidi="ar-TN"/>
+                              </w:rPr>
+                              <w:t>:</w:t>
+                            </w:r>
+                            <w:r>
+                              <w:rPr>
+                                <w:rFonts w:ascii="Angsana New" w:hAnsi="Angsana New" w:cs="Andalus"/>
+                                <w:b/>
+                                <w:bCs/>
+                                <w:color w:val="FF0000"/>
+                                <w:sz w:val="96"/>
+                                <w:szCs w:val="96"/>
+                                <w:lang w:bidi="ar-TN"/>
+                              </w:rPr>
+                              <w:t>{</w:t>
+                            </w:r>
+                            <w:proofErr w:type="gramEnd"/>
+                            <w:r>
+                              <w:rPr>
+                                <w:rFonts w:ascii="Angsana New" w:hAnsi="Angsana New" w:cs="Andalus"/>
+                                <w:b/>
+                                <w:bCs/>
+                                <w:color w:val="FF0000"/>
+                                <w:sz w:val="96"/>
+                                <w:szCs w:val="96"/>
+                                <w:lang w:bidi="ar-TN"/>
+                              </w:rPr>
+                              <w:t>{nb}}</w:t>
+                            </w:r>
+                            <w:r>
+                              <w:rPr>
+                                <w:rFonts w:ascii="Angsana New" w:hAnsi="Angsana New" w:cs="Andalus"/>
+                                <w:b/>
+                                <w:bCs/>
+                                <w:color w:val="17365D" w:themeColor="text2" w:themeShade="BF"/>
+                                <w:sz w:val="96"/>
+                                <w:szCs w:val="96"/>
+                                <w:lang w:bidi="ar-TN"/>
+                              </w:rPr>
+                              <w:t xml:space="preserve"> </w:t>
                             </w:r>
                           </w:p>
                           <w:p/>
@@ -1177,7 +1333,7 @@
           </mc:Choice>
           <mc:Fallback>
             <w:pict>
-              <v:shape w14:anchorId="07FCF1DE" id="Text Box 8" o:spid="_x0000_s1029" type="#_x0000_t202" style="position:absolute;margin-left:-24pt;margin-top:33.55pt;width:340.55pt;height:199.9pt;z-index:251662336;visibility:visible;mso-wrap-style:square;mso-width-percent:0;mso-height-percent:0;mso-wrap-distance-left:9pt;mso-wrap-distance-top:0;mso-wrap-distance-right:9pt;mso-wrap-distance-bottom:0;mso-position-horizontal:absolute;mso-position-horizontal-relative:text;mso-position-vertical:absolute;mso-position-vertical-relative:text;mso-width-percent:0;mso-height-percent:0;mso-width-relative:page;mso-height-relative:page;v-text-anchor:top" o:gfxdata="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" stroked="f">
+              <v:shape w14:anchorId="07FCF1DE" id="Text Box 8" o:spid="_x0000_s1029" type="#_x0000_t202" style="position:absolute;margin-left:-24pt;margin-top:33.55pt;width:340.55pt;height:199.9pt;z-index:251662336;visibility:visible;mso-wrap-style:square;mso-width-percent:0;mso-height-percent:0;mso-wrap-distance-left:9pt;mso-wrap-distance-top:0;mso-wrap-distance-right:9pt;mso-wrap-distance-bottom:0;mso-position-horizontal:absolute;mso-position-horizontal-relative:text;mso-position-vertical:absolute;mso-position-vertical-relative:text;mso-width-percent:0;mso-height-percent:0;mso-width-relative:page;mso-height-relative:page;v-text-anchor:top" o:gfxdata="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" stroked="f">
                 <v:textbox>
                   <w:txbxContent>
                     <w:p>
@@ -1261,19 +1417,71 @@
                           <w:rtl/>
                           <w:lang w:bidi="ar-TN"/>
                         </w:rPr>
-                        <w:t>عدد التلاميذ:</w:t>
-                      </w:r>
-                      <w:r>
-                        <w:rPr>
-                          <w:rFonts w:ascii="Angsana New" w:hAnsi="Angsana New" w:cs="Andalus"/>
+                        <w:t xml:space="preserve">عدد </w:t>
+                      </w:r>
+                      <w:proofErr w:type="gramStart"/>
+                      <w:r>
+                        <w:rPr>
+                          <w:rFonts w:ascii="Angsana New" w:hAnsi="Angsana New" w:cs="Andalus" w:hint="cs"/>
                           <w:b/>
                           <w:bCs/>
                           <w:color w:val="17365D" w:themeColor="text2" w:themeShade="BF"/>
                           <w:sz w:val="96"/>
                           <w:szCs w:val="96"/>
-                          <w:lang w:bidi="ar-TN"/>
-                        </w:rPr>
-                        <w:t xml:space="preserve">{{nb}} </w:t>
+                          <w:rtl/>
+                          <w:lang w:bidi="ar-TN"/>
+                        </w:rPr>
+                        <w:t>التلاميذ</w:t>
+                      </w:r>
+                      <w:r>
+                        <w:rPr>
+                          <w:rFonts w:ascii="Angsana New" w:hAnsi="Angsana New" w:cs="Andalus" w:hint="cs"/>
+                          <w:b/>
+                          <w:bCs/>
+                          <w:color w:val="365F91" w:themeColor="accent1" w:themeShade="BF"/>
+                          <w:sz w:val="96"/>
+                          <w:szCs w:val="96"/>
+                          <w:rtl/>
+                          <w:lang w:bidi="ar-TN"/>
+                        </w:rPr>
+                        <w:t>:</w:t>
+                      </w:r>
+                      <w:r>
+                        <w:rPr>
+                          <w:rFonts w:ascii="Angsana New" w:hAnsi="Angsana New" w:cs="Andalus"/>
+                          <w:b/>
+                          <w:bCs/>
+                          <w:color w:val="FF0000"/>
+                          <w:sz w:val="96"/>
+                          <w:szCs w:val="96"/>
+                          <w:lang w:bidi="ar-TN"/>
+                        </w:rPr>
+                        <w:t>{</w:t>
+                      </w:r>
+                      <w:proofErr w:type="gramEnd"/>
+                      <w:r>
+                        <w:rPr>
+                          <w:rFonts w:ascii="Angsana New" w:hAnsi="Angsana New" w:cs="Andalus"/>
+                          <w:b/>
+                          <w:bCs/>
+                          <w:color w:val="FF0000"/>
+                          <w:sz w:val="96"/>
+                          <w:szCs w:val="96"/>
+                          <w:lang w:bidi="ar-TN"/>
+                        </w:rPr>
+                        <w:t>{nb}}</w:t>
+                      </w:r>
+                      <w:r>
+                        <w:rPr>
+                          <w:rFonts w:ascii="Angsana New" w:hAnsi="Angsana New" w:cs="Andalus"/>
+                          <w:b/>
+                          <w:bCs/>
+                          <w:color w:val="17365D" w:themeColor="text2" w:themeShade="BF"/>
+                          <w:sz w:val="96"/>
+                          <w:szCs w:val="96"/>
+                          <w:lang w:bidi="ar-TN"/>
+                        </w:rPr>
+                        <w:t xml:space="preserve"> </w:t>
                       </w:r>
                     </w:p>
                     <w:p/>
@@ -1423,10 +1631,22 @@
                                 <w:szCs w:val="96"/>
                                 <w:lang w:bidi="ar-TN"/>
                               </w:rPr>
-                              <w:t>{{serie</w:t>
-                            </w:r>
-                            <w:bookmarkStart w:id="0" w:name="_GoBack"/>
-                            <w:bookmarkEnd w:id="0"/>
+                              <w:t>{{</w:t>
+                            </w:r>
+                            <w:proofErr w:type="spellStart"/>
+                            <w:r>
+                              <w:rPr>
+                                <w:rFonts w:ascii="Angsana New" w:hAnsi="Angsana New" w:cs="Angsana New"/>
+                                <w:b/>
+                                <w:bCs/>
+                                <w:color w:val="0070C0"/>
+                                <w:sz w:val="96"/>
+                                <w:szCs w:val="96"/>
+                                <w:lang w:bidi="ar-TN"/>
+                              </w:rPr>
+                              <w:t>serie</w:t>
+                            </w:r>
+                            <w:proofErr w:type="spellEnd"/>
                             <w:r>
                               <w:rPr>
                                 <w:rFonts w:ascii="Angsana New" w:hAnsi="Angsana New" w:cs="Angsana New"/>
@@ -1459,7 +1679,7 @@
           </mc:Choice>
           <mc:Fallback>
             <w:pict>
-              <v:shape w14:anchorId="063DB2B1" id="Text Box 9" o:spid="_x0000_s1030" type="#_x0000_t202" style="position:absolute;margin-left:408.6pt;margin-top:7.55pt;width:315.95pt;height:164.65pt;z-index:251663360;visibility:visible;mso-wrap-style:square;mso-width-percent:0;mso-height-percent:0;mso-wrap-distance-left:9pt;mso-wrap-distance-top:0;mso-wrap-distance-right:9pt;mso-wrap-distance-bottom:0;mso-position-horizontal:absolute;mso-position-horizontal-relative:text;mso-position-vertical:absolute;mso-position-vertical-relative:text;mso-width-percent:0;mso-height-percent:0;mso-width-relative:page;mso-height-relative:page;v-text-anchor:top" o:gfxdata="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" stroked="f">
+              <v:shape w14:anchorId="063DB2B1" id="Text Box 9" o:spid="_x0000_s1030" type="#_x0000_t202" style="position:absolute;margin-left:408.6pt;margin-top:7.55pt;width:315.95pt;height:164.65pt;z-index:251663360;visibility:visible;mso-wrap-style:square;mso-width-percent:0;mso-height-percent:0;mso-wrap-distance-left:9pt;mso-wrap-distance-top:0;mso-wrap-distance-right:9pt;mso-wrap-distance-bottom:0;mso-position-horizontal:absolute;mso-position-horizontal-relative:text;mso-position-vertical:absolute;mso-position-vertical-relative:text;mso-width-percent:0;mso-height-percent:0;mso-width-relative:page;mso-height-relative:page;v-text-anchor:top" o:gfxdata="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" stroked="f">
                 <v:textbox>
                   <w:txbxContent>
                     <w:p>
@@ -1530,10 +1750,22 @@
                           <w:szCs w:val="96"/>
                           <w:lang w:bidi="ar-TN"/>
                         </w:rPr>
-                        <w:t>{{serie</w:t>
-                      </w:r>
-                      <w:bookmarkStart w:id="1" w:name="_GoBack"/>
-                      <w:bookmarkEnd w:id="1"/>
+                        <w:t>{{</w:t>
+                      </w:r>
+                      <w:proofErr w:type="spellStart"/>
+                      <w:r>
+                        <w:rPr>
+                          <w:rFonts w:ascii="Angsana New" w:hAnsi="Angsana New" w:cs="Angsana New"/>
+                          <w:b/>
+                          <w:bCs/>
+                          <w:color w:val="0070C0"/>
+                          <w:sz w:val="96"/>
+                          <w:szCs w:val="96"/>
+                          <w:lang w:bidi="ar-TN"/>
+                        </w:rPr>
+                        <w:t>serie</w:t>
+                      </w:r>
+                      <w:proofErr w:type="spellEnd"/>
                       <w:r>
                         <w:rPr>
                           <w:rFonts w:ascii="Angsana New" w:hAnsi="Angsana New" w:cs="Angsana New"/>
@@ -1613,7 +1845,7 @@
 </file>
 
 <file path=word/styles.xml><?xml version="1.0" encoding="utf-8"?>
-<w:styles xmlns:mc="http://schemas.openxmlformats.org/markup-compatibility/2006" xmlns:r="http://schemas.openxmlformats.org/officeDocument/2006/relationships" xmlns:w="http://schemas.openxmlformats.org/wordprocessingml/2006/main" xmlns:w14="http://schemas.microsoft.com/office/word/2010/wordml" xmlns:w15="http://schemas.microsoft.com/office/word/2012/wordml" xmlns:w16se="http://schemas.microsoft.com/office/word/2015/wordml/symex" mc:Ignorable="w14 w15 w16se">
+<w:styles xmlns:mc="http://schemas.openxmlformats.org/markup-compatibility/2006" xmlns:r="http://schemas.openxmlformats.org/officeDocument/2006/relationships" xmlns:w="http://schemas.openxmlformats.org/wordprocessingml/2006/main" xmlns:w14="http://schemas.microsoft.com/office/word/2010/wordml" xmlns:w15="http://schemas.microsoft.com/office/word/2012/wordml" xmlns:w16cex="http://schemas.microsoft.com/office/word/2018/wordml/cex" xmlns:w16cid="http://schemas.microsoft.com/office/word/2016/wordml/cid" xmlns:w16="http://schemas.microsoft.com/office/word/2018/wordml" xmlns:w16sdtdh="http://schemas.microsoft.com/office/word/2020/wordml/sdtdatahash" xmlns:w16se="http://schemas.microsoft.com/office/word/2015/wordml/symex" mc:Ignorable="w14 w15 w16se w16cid w16 w16cex w16sdtdh">
   <w:docDefaults>
     <w:rPrDefault>
       <w:rPr>
@@ -1629,7 +1861,7 @@
       </w:pPr>
     </w:pPrDefault>
   </w:docDefaults>
-  <w:latentStyles w:defLockedState="0" w:defUIPriority="99" w:defSemiHidden="0" w:defUnhideWhenUsed="0" w:defQFormat="0" w:count="371">
+  <w:latentStyles w:defLockedState="0" w:defUIPriority="99" w:defSemiHidden="0" w:defUnhideWhenUsed="0" w:defQFormat="0" w:count="376">
     <w:lsdException w:name="Normal" w:uiPriority="0" w:qFormat="1"/>
     <w:lsdException w:name="heading 1" w:uiPriority="9" w:qFormat="1"/>
     <w:lsdException w:name="heading 2" w:semiHidden="1" w:uiPriority="9" w:unhideWhenUsed="1" w:qFormat="1"/>
@@ -1735,7 +1967,6 @@
     <w:lsdException w:name="HTML Sample" w:semiHidden="1" w:unhideWhenUsed="1"/>
     <w:lsdException w:name="HTML Typewriter" w:semiHidden="1" w:unhideWhenUsed="1"/>
     <w:lsdException w:name="HTML Variable" w:semiHidden="1" w:unhideWhenUsed="1"/>
-    <w:lsdException w:name="Normal Table" w:semiHidden="1" w:unhideWhenUsed="1"/>
     <w:lsdException w:name="annotation subject" w:semiHidden="1" w:unhideWhenUsed="1"/>
     <w:lsdException w:name="No List" w:semiHidden="1" w:unhideWhenUsed="1"/>
     <w:lsdException w:name="Outline List 1" w:semiHidden="1" w:unhideWhenUsed="1"/>
@@ -1778,11 +2009,8 @@
     <w:lsdException w:name="Table Contemporary" w:semiHidden="1" w:unhideWhenUsed="1"/>
     <w:lsdException w:name="Table Elegant" w:semiHidden="1" w:unhideWhenUsed="1"/>
     <w:lsdException w:name="Table Professional" w:semiHidden="1" w:unhideWhenUsed="1"/>
-    <w:lsdException w:name="Table Subtle 1" w:semiHidden="1" w:unhideWhenUsed="1"/>
     <w:lsdException w:name="Table Subtle 2" w:semiHidden="1" w:unhideWhenUsed="1"/>
     <w:lsdException w:name="Table Web 1" w:semiHidden="1" w:unhideWhenUsed="1"/>
-    <w:lsdException w:name="Table Web 2" w:semiHidden="1" w:unhideWhenUsed="1"/>
-    <w:lsdException w:name="Table Web 3" w:semiHidden="1" w:unhideWhenUsed="1"/>
     <w:lsdException w:name="Balloon Text" w:semiHidden="1" w:unhideWhenUsed="1"/>
     <w:lsdException w:name="Table Grid" w:uiPriority="59"/>
     <w:lsdException w:name="Table Theme" w:semiHidden="1" w:unhideWhenUsed="1"/>
@@ -2001,6 +2229,11 @@
     <w:lsdException w:name="List Table 5 Dark Accent 6" w:uiPriority="50"/>
     <w:lsdException w:name="List Table 6 Colorful Accent 6" w:uiPriority="51"/>
     <w:lsdException w:name="List Table 7 Colorful Accent 6" w:uiPriority="52"/>
+    <w:lsdException w:name="Mention" w:semiHidden="1" w:unhideWhenUsed="1"/>
+    <w:lsdException w:name="Smart Hyperlink" w:semiHidden="1" w:unhideWhenUsed="1"/>
+    <w:lsdException w:name="Hashtag" w:semiHidden="1" w:unhideWhenUsed="1"/>
+    <w:lsdException w:name="Unresolved Mention" w:semiHidden="1" w:unhideWhenUsed="1"/>
+    <w:lsdException w:name="Smart Link" w:semiHidden="1" w:unhideWhenUsed="1"/>
   </w:latentStyles>
   <w:style w:type="paragraph" w:default="1" w:styleId="Normal">
     <w:name w:val="Normal"/>

</xml_diff>